<commit_message>
Update lab report for PyCharm workflow
</commit_message>
<xml_diff>
--- a/ОТЧЕТ_ЛР.docx
+++ b/ОТЧЕТ_ЛР.docx
@@ -690,6 +690,7 @@
     </w:tbl>
     <w:p>
       <w:pPr>
+        <w:spacing w:line="360" w:lineRule="auto"/>
         <w:jc w:val="both"/>
       </w:pPr>
     </w:p>
@@ -761,7 +762,7 @@
           <w:b w:val="0"/>
           <w:sz w:val="28"/>
         </w:rPr>
-        <w:t>Добавлен PythonSettings.json для обнаружения unittest-тестов в Visual Studio при открытии папки проекта.</w:t>
+        <w:t>Добавлен PythonSettings.json для обнаружения unittest-тестов при открытии папки проекта. В PyCharm запуск тестов выполняется через конфигурацию Python tests или через встроенный Terminal; файл PythonSettings.json оставлен как дополнительная настройка для совместимости с заданием.</w:t>
       </w:r>
     </w:p>
     <w:p>
@@ -796,7 +797,7 @@
     </w:p>
     <w:p>
       <w:pPr>
-        <w:spacing w:line="240" w:lineRule="auto" w:after="0"/>
+        <w:spacing w:line="360" w:lineRule="auto" w:after="0"/>
         <w:ind w:left="340"/>
         <w:jc w:val="left"/>
       </w:pPr>
@@ -811,7 +812,7 @@
     </w:p>
     <w:p>
       <w:pPr>
-        <w:spacing w:line="240" w:lineRule="auto" w:after="0"/>
+        <w:spacing w:line="360" w:lineRule="auto" w:after="0"/>
         <w:ind w:left="340"/>
         <w:jc w:val="left"/>
       </w:pPr>
@@ -826,7 +827,7 @@
     </w:p>
     <w:p>
       <w:pPr>
-        <w:spacing w:line="240" w:lineRule="auto" w:after="0"/>
+        <w:spacing w:line="360" w:lineRule="auto" w:after="0"/>
         <w:ind w:left="340"/>
         <w:jc w:val="left"/>
       </w:pPr>
@@ -841,7 +842,7 @@
     </w:p>
     <w:p>
       <w:pPr>
-        <w:spacing w:line="240" w:lineRule="auto" w:after="0"/>
+        <w:spacing w:line="360" w:lineRule="auto" w:after="0"/>
         <w:ind w:left="340"/>
         <w:jc w:val="left"/>
       </w:pPr>
@@ -856,7 +857,7 @@
     </w:p>
     <w:p>
       <w:pPr>
-        <w:spacing w:line="240" w:lineRule="auto" w:after="0"/>
+        <w:spacing w:line="360" w:lineRule="auto" w:after="0"/>
         <w:ind w:left="340"/>
         <w:jc w:val="left"/>
       </w:pPr>
@@ -871,7 +872,7 @@
     </w:p>
     <w:p>
       <w:pPr>
-        <w:spacing w:line="240" w:lineRule="auto" w:after="0"/>
+        <w:spacing w:line="360" w:lineRule="auto" w:after="0"/>
         <w:ind w:left="340"/>
         <w:jc w:val="left"/>
       </w:pPr>
@@ -886,7 +887,7 @@
     </w:p>
     <w:p>
       <w:pPr>
-        <w:spacing w:line="240" w:lineRule="auto" w:after="0"/>
+        <w:spacing w:line="360" w:lineRule="auto" w:after="0"/>
         <w:ind w:left="340"/>
         <w:jc w:val="left"/>
       </w:pPr>
@@ -901,7 +902,7 @@
     </w:p>
     <w:p>
       <w:pPr>
-        <w:spacing w:line="240" w:lineRule="auto" w:after="0"/>
+        <w:spacing w:line="360" w:lineRule="auto" w:after="0"/>
         <w:ind w:left="340"/>
         <w:jc w:val="left"/>
       </w:pPr>
@@ -916,7 +917,7 @@
     </w:p>
     <w:p>
       <w:pPr>
-        <w:spacing w:line="240" w:lineRule="auto" w:after="0"/>
+        <w:spacing w:line="360" w:lineRule="auto" w:after="0"/>
         <w:ind w:left="340"/>
         <w:jc w:val="left"/>
       </w:pPr>
@@ -931,7 +932,7 @@
     </w:p>
     <w:p>
       <w:pPr>
-        <w:spacing w:line="240" w:lineRule="auto" w:after="0"/>
+        <w:spacing w:line="360" w:lineRule="auto" w:after="0"/>
         <w:ind w:left="340"/>
         <w:jc w:val="left"/>
       </w:pPr>
@@ -946,7 +947,7 @@
     </w:p>
     <w:p>
       <w:pPr>
-        <w:spacing w:line="240" w:lineRule="auto" w:after="0"/>
+        <w:spacing w:line="360" w:lineRule="auto" w:after="0"/>
         <w:ind w:left="340"/>
         <w:jc w:val="left"/>
       </w:pPr>
@@ -961,7 +962,7 @@
     </w:p>
     <w:p>
       <w:pPr>
-        <w:spacing w:line="240" w:lineRule="auto" w:after="0"/>
+        <w:spacing w:line="360" w:lineRule="auto" w:after="0"/>
         <w:ind w:left="340"/>
         <w:jc w:val="left"/>
       </w:pPr>
@@ -976,7 +977,7 @@
     </w:p>
     <w:p>
       <w:pPr>
-        <w:spacing w:line="240" w:lineRule="auto" w:after="0"/>
+        <w:spacing w:line="360" w:lineRule="auto" w:after="0"/>
         <w:ind w:left="340"/>
         <w:jc w:val="left"/>
       </w:pPr>
@@ -991,7 +992,7 @@
     </w:p>
     <w:p>
       <w:pPr>
-        <w:spacing w:line="240" w:lineRule="auto" w:after="0"/>
+        <w:spacing w:line="360" w:lineRule="auto" w:after="0"/>
         <w:ind w:left="340"/>
         <w:jc w:val="left"/>
       </w:pPr>
@@ -1021,7 +1022,7 @@
     </w:p>
     <w:p>
       <w:pPr>
-        <w:spacing w:line="240" w:lineRule="auto" w:after="0"/>
+        <w:spacing w:line="360" w:lineRule="auto" w:after="0"/>
         <w:ind w:left="340"/>
         <w:jc w:val="left"/>
       </w:pPr>
@@ -1036,7 +1037,7 @@
     </w:p>
     <w:p>
       <w:pPr>
-        <w:spacing w:line="240" w:lineRule="auto" w:after="0"/>
+        <w:spacing w:line="360" w:lineRule="auto" w:after="0"/>
         <w:ind w:left="340"/>
         <w:jc w:val="left"/>
       </w:pPr>
@@ -1051,7 +1052,7 @@
     </w:p>
     <w:p>
       <w:pPr>
-        <w:spacing w:line="240" w:lineRule="auto" w:after="0"/>
+        <w:spacing w:line="360" w:lineRule="auto" w:after="0"/>
         <w:ind w:left="340"/>
         <w:jc w:val="left"/>
       </w:pPr>
@@ -1066,7 +1067,7 @@
     </w:p>
     <w:p>
       <w:pPr>
-        <w:spacing w:line="240" w:lineRule="auto" w:after="0"/>
+        <w:spacing w:line="360" w:lineRule="auto" w:after="0"/>
         <w:ind w:left="340"/>
         <w:jc w:val="left"/>
       </w:pPr>
@@ -1081,7 +1082,7 @@
     </w:p>
     <w:p>
       <w:pPr>
-        <w:spacing w:line="240" w:lineRule="auto" w:after="0"/>
+        <w:spacing w:line="360" w:lineRule="auto" w:after="0"/>
         <w:ind w:left="340"/>
         <w:jc w:val="left"/>
       </w:pPr>
@@ -1096,7 +1097,7 @@
     </w:p>
     <w:p>
       <w:pPr>
-        <w:spacing w:line="240" w:lineRule="auto" w:after="0"/>
+        <w:spacing w:line="360" w:lineRule="auto" w:after="0"/>
         <w:ind w:left="340"/>
         <w:jc w:val="left"/>
       </w:pPr>
@@ -1111,7 +1112,7 @@
     </w:p>
     <w:p>
       <w:pPr>
-        <w:spacing w:line="240" w:lineRule="auto" w:after="0"/>
+        <w:spacing w:line="360" w:lineRule="auto" w:after="0"/>
         <w:ind w:left="340"/>
         <w:jc w:val="left"/>
       </w:pPr>
@@ -1126,7 +1127,7 @@
     </w:p>
     <w:p>
       <w:pPr>
-        <w:spacing w:line="240" w:lineRule="auto" w:after="0"/>
+        <w:spacing w:line="360" w:lineRule="auto" w:after="0"/>
         <w:ind w:left="340"/>
         <w:jc w:val="left"/>
       </w:pPr>
@@ -1141,7 +1142,7 @@
     </w:p>
     <w:p>
       <w:pPr>
-        <w:spacing w:line="240" w:lineRule="auto" w:after="0"/>
+        <w:spacing w:line="360" w:lineRule="auto" w:after="0"/>
         <w:ind w:left="340"/>
         <w:jc w:val="left"/>
       </w:pPr>
@@ -1156,7 +1157,7 @@
     </w:p>
     <w:p>
       <w:pPr>
-        <w:spacing w:line="240" w:lineRule="auto" w:after="0"/>
+        <w:spacing w:line="360" w:lineRule="auto" w:after="0"/>
         <w:ind w:left="340"/>
         <w:jc w:val="left"/>
       </w:pPr>
@@ -1171,7 +1172,7 @@
     </w:p>
     <w:p>
       <w:pPr>
-        <w:spacing w:line="240" w:lineRule="auto" w:after="0"/>
+        <w:spacing w:line="360" w:lineRule="auto" w:after="0"/>
         <w:ind w:left="340"/>
         <w:jc w:val="left"/>
       </w:pPr>
@@ -1186,7 +1187,7 @@
     </w:p>
     <w:p>
       <w:pPr>
-        <w:spacing w:line="240" w:lineRule="auto" w:after="0"/>
+        <w:spacing w:line="360" w:lineRule="auto" w:after="0"/>
         <w:ind w:left="340"/>
         <w:jc w:val="left"/>
       </w:pPr>
@@ -1201,7 +1202,7 @@
     </w:p>
     <w:p>
       <w:pPr>
-        <w:spacing w:line="240" w:lineRule="auto" w:after="0"/>
+        <w:spacing w:line="360" w:lineRule="auto" w:after="0"/>
         <w:ind w:left="340"/>
         <w:jc w:val="left"/>
       </w:pPr>
@@ -1216,7 +1217,7 @@
     </w:p>
     <w:p>
       <w:pPr>
-        <w:spacing w:line="240" w:lineRule="auto" w:after="0"/>
+        <w:spacing w:line="360" w:lineRule="auto" w:after="0"/>
         <w:ind w:left="340"/>
         <w:jc w:val="left"/>
       </w:pPr>
@@ -1231,7 +1232,7 @@
     </w:p>
     <w:p>
       <w:pPr>
-        <w:spacing w:line="240" w:lineRule="auto" w:after="0"/>
+        <w:spacing w:line="360" w:lineRule="auto" w:after="0"/>
         <w:ind w:left="340"/>
         <w:jc w:val="left"/>
       </w:pPr>
@@ -1246,7 +1247,7 @@
     </w:p>
     <w:p>
       <w:pPr>
-        <w:spacing w:line="240" w:lineRule="auto" w:after="0"/>
+        <w:spacing w:line="360" w:lineRule="auto" w:after="0"/>
         <w:ind w:left="340"/>
         <w:jc w:val="left"/>
       </w:pPr>
@@ -1261,7 +1262,7 @@
     </w:p>
     <w:p>
       <w:pPr>
-        <w:spacing w:line="240" w:lineRule="auto" w:after="0"/>
+        <w:spacing w:line="360" w:lineRule="auto" w:after="0"/>
         <w:ind w:left="340"/>
         <w:jc w:val="left"/>
       </w:pPr>
@@ -1276,7 +1277,7 @@
     </w:p>
     <w:p>
       <w:pPr>
-        <w:spacing w:line="240" w:lineRule="auto" w:after="0"/>
+        <w:spacing w:line="360" w:lineRule="auto" w:after="0"/>
         <w:ind w:left="340"/>
         <w:jc w:val="left"/>
       </w:pPr>
@@ -1291,7 +1292,7 @@
     </w:p>
     <w:p>
       <w:pPr>
-        <w:spacing w:line="240" w:lineRule="auto" w:after="0"/>
+        <w:spacing w:line="360" w:lineRule="auto" w:after="0"/>
         <w:ind w:left="340"/>
         <w:jc w:val="left"/>
       </w:pPr>
@@ -1306,7 +1307,7 @@
     </w:p>
     <w:p>
       <w:pPr>
-        <w:spacing w:line="240" w:lineRule="auto" w:after="0"/>
+        <w:spacing w:line="360" w:lineRule="auto" w:after="0"/>
         <w:ind w:left="340"/>
         <w:jc w:val="left"/>
       </w:pPr>
@@ -1321,7 +1322,7 @@
     </w:p>
     <w:p>
       <w:pPr>
-        <w:spacing w:line="240" w:lineRule="auto" w:after="0"/>
+        <w:spacing w:line="360" w:lineRule="auto" w:after="0"/>
         <w:ind w:left="340"/>
         <w:jc w:val="left"/>
       </w:pPr>
@@ -1336,7 +1337,7 @@
     </w:p>
     <w:p>
       <w:pPr>
-        <w:spacing w:line="240" w:lineRule="auto" w:after="0"/>
+        <w:spacing w:line="360" w:lineRule="auto" w:after="0"/>
         <w:ind w:left="340"/>
         <w:jc w:val="left"/>
       </w:pPr>
@@ -1351,7 +1352,7 @@
     </w:p>
     <w:p>
       <w:pPr>
-        <w:spacing w:line="240" w:lineRule="auto" w:after="0"/>
+        <w:spacing w:line="360" w:lineRule="auto" w:after="0"/>
         <w:ind w:left="340"/>
         <w:jc w:val="left"/>
       </w:pPr>
@@ -1366,7 +1367,7 @@
     </w:p>
     <w:p>
       <w:pPr>
-        <w:spacing w:line="240" w:lineRule="auto" w:after="0"/>
+        <w:spacing w:line="360" w:lineRule="auto" w:after="0"/>
         <w:ind w:left="340"/>
         <w:jc w:val="left"/>
       </w:pPr>
@@ -1381,7 +1382,7 @@
     </w:p>
     <w:p>
       <w:pPr>
-        <w:spacing w:line="240" w:lineRule="auto" w:after="0"/>
+        <w:spacing w:line="360" w:lineRule="auto" w:after="0"/>
         <w:ind w:left="340"/>
         <w:jc w:val="left"/>
       </w:pPr>
@@ -1396,7 +1397,7 @@
     </w:p>
     <w:p>
       <w:pPr>
-        <w:spacing w:line="240" w:lineRule="auto" w:after="0"/>
+        <w:spacing w:line="360" w:lineRule="auto" w:after="0"/>
         <w:ind w:left="340"/>
         <w:jc w:val="left"/>
       </w:pPr>
@@ -1411,7 +1412,7 @@
     </w:p>
     <w:p>
       <w:pPr>
-        <w:spacing w:line="240" w:lineRule="auto" w:after="0"/>
+        <w:spacing w:line="360" w:lineRule="auto" w:after="0"/>
         <w:ind w:left="340"/>
         <w:jc w:val="left"/>
       </w:pPr>
@@ -1426,7 +1427,7 @@
     </w:p>
     <w:p>
       <w:pPr>
-        <w:spacing w:line="240" w:lineRule="auto" w:after="0"/>
+        <w:spacing w:line="360" w:lineRule="auto" w:after="0"/>
         <w:ind w:left="340"/>
         <w:jc w:val="left"/>
       </w:pPr>
@@ -1441,7 +1442,7 @@
     </w:p>
     <w:p>
       <w:pPr>
-        <w:spacing w:line="240" w:lineRule="auto" w:after="0"/>
+        <w:spacing w:line="360" w:lineRule="auto" w:after="0"/>
         <w:ind w:left="340"/>
         <w:jc w:val="left"/>
       </w:pPr>
@@ -1456,7 +1457,7 @@
     </w:p>
     <w:p>
       <w:pPr>
-        <w:spacing w:line="240" w:lineRule="auto" w:after="0"/>
+        <w:spacing w:line="360" w:lineRule="auto" w:after="0"/>
         <w:ind w:left="340"/>
         <w:jc w:val="left"/>
       </w:pPr>
@@ -1471,7 +1472,7 @@
     </w:p>
     <w:p>
       <w:pPr>
-        <w:spacing w:line="240" w:lineRule="auto" w:after="0"/>
+        <w:spacing w:line="360" w:lineRule="auto" w:after="0"/>
         <w:ind w:left="340"/>
         <w:jc w:val="left"/>
       </w:pPr>
@@ -1486,7 +1487,7 @@
     </w:p>
     <w:p>
       <w:pPr>
-        <w:spacing w:line="240" w:lineRule="auto" w:after="0"/>
+        <w:spacing w:line="360" w:lineRule="auto" w:after="0"/>
         <w:ind w:left="340"/>
         <w:jc w:val="left"/>
       </w:pPr>
@@ -1501,7 +1502,7 @@
     </w:p>
     <w:p>
       <w:pPr>
-        <w:spacing w:line="240" w:lineRule="auto" w:after="0"/>
+        <w:spacing w:line="360" w:lineRule="auto" w:after="0"/>
         <w:ind w:left="340"/>
         <w:jc w:val="left"/>
       </w:pPr>
@@ -1516,7 +1517,7 @@
     </w:p>
     <w:p>
       <w:pPr>
-        <w:spacing w:line="240" w:lineRule="auto" w:after="0"/>
+        <w:spacing w:line="360" w:lineRule="auto" w:after="0"/>
         <w:ind w:left="340"/>
         <w:jc w:val="left"/>
       </w:pPr>
@@ -1531,7 +1532,7 @@
     </w:p>
     <w:p>
       <w:pPr>
-        <w:spacing w:line="240" w:lineRule="auto" w:after="0"/>
+        <w:spacing w:line="360" w:lineRule="auto" w:after="0"/>
         <w:ind w:left="340"/>
         <w:jc w:val="left"/>
       </w:pPr>
@@ -1561,7 +1562,7 @@
     </w:p>
     <w:p>
       <w:pPr>
-        <w:spacing w:line="240" w:lineRule="auto" w:after="0"/>
+        <w:spacing w:line="360" w:lineRule="auto" w:after="0"/>
         <w:ind w:left="340"/>
         <w:jc w:val="left"/>
       </w:pPr>
@@ -1576,7 +1577,7 @@
     </w:p>
     <w:p>
       <w:pPr>
-        <w:spacing w:line="240" w:lineRule="auto" w:after="0"/>
+        <w:spacing w:line="360" w:lineRule="auto" w:after="0"/>
         <w:ind w:left="340"/>
         <w:jc w:val="left"/>
       </w:pPr>
@@ -1591,7 +1592,7 @@
     </w:p>
     <w:p>
       <w:pPr>
-        <w:spacing w:line="240" w:lineRule="auto" w:after="0"/>
+        <w:spacing w:line="360" w:lineRule="auto" w:after="0"/>
         <w:ind w:left="340"/>
         <w:jc w:val="left"/>
       </w:pPr>
@@ -1606,7 +1607,7 @@
     </w:p>
     <w:p>
       <w:pPr>
-        <w:spacing w:line="240" w:lineRule="auto" w:after="0"/>
+        <w:spacing w:line="360" w:lineRule="auto" w:after="0"/>
         <w:ind w:left="340"/>
         <w:jc w:val="left"/>
       </w:pPr>
@@ -1621,7 +1622,7 @@
     </w:p>
     <w:p>
       <w:pPr>
-        <w:spacing w:line="240" w:lineRule="auto" w:after="0"/>
+        <w:spacing w:line="360" w:lineRule="auto" w:after="0"/>
         <w:ind w:left="340"/>
         <w:jc w:val="left"/>
       </w:pPr>
@@ -1636,7 +1637,7 @@
     </w:p>
     <w:p>
       <w:pPr>
-        <w:spacing w:line="240" w:lineRule="auto" w:after="0"/>
+        <w:spacing w:line="360" w:lineRule="auto" w:after="0"/>
         <w:ind w:left="340"/>
         <w:jc w:val="left"/>
       </w:pPr>
@@ -1651,7 +1652,7 @@
     </w:p>
     <w:p>
       <w:pPr>
-        <w:spacing w:line="240" w:lineRule="auto" w:after="0"/>
+        <w:spacing w:line="360" w:lineRule="auto" w:after="0"/>
         <w:ind w:left="340"/>
         <w:jc w:val="left"/>
       </w:pPr>
@@ -1666,7 +1667,7 @@
     </w:p>
     <w:p>
       <w:pPr>
-        <w:spacing w:line="240" w:lineRule="auto" w:after="0"/>
+        <w:spacing w:line="360" w:lineRule="auto" w:after="0"/>
         <w:ind w:left="340"/>
         <w:jc w:val="left"/>
       </w:pPr>
@@ -1681,7 +1682,7 @@
     </w:p>
     <w:p>
       <w:pPr>
-        <w:spacing w:line="240" w:lineRule="auto" w:after="0"/>
+        <w:spacing w:line="360" w:lineRule="auto" w:after="0"/>
         <w:ind w:left="340"/>
         <w:jc w:val="left"/>
       </w:pPr>
@@ -1696,7 +1697,7 @@
     </w:p>
     <w:p>
       <w:pPr>
-        <w:spacing w:line="240" w:lineRule="auto" w:after="0"/>
+        <w:spacing w:line="360" w:lineRule="auto" w:after="0"/>
         <w:ind w:left="340"/>
         <w:jc w:val="left"/>
       </w:pPr>
@@ -1711,7 +1712,7 @@
     </w:p>
     <w:p>
       <w:pPr>
-        <w:spacing w:line="240" w:lineRule="auto" w:after="0"/>
+        <w:spacing w:line="360" w:lineRule="auto" w:after="0"/>
         <w:ind w:left="340"/>
         <w:jc w:val="left"/>
       </w:pPr>
@@ -1726,7 +1727,7 @@
     </w:p>
     <w:p>
       <w:pPr>
-        <w:spacing w:line="240" w:lineRule="auto" w:after="0"/>
+        <w:spacing w:line="360" w:lineRule="auto" w:after="0"/>
         <w:ind w:left="340"/>
         <w:jc w:val="left"/>
       </w:pPr>
@@ -1741,7 +1742,7 @@
     </w:p>
     <w:p>
       <w:pPr>
-        <w:spacing w:line="240" w:lineRule="auto" w:after="0"/>
+        <w:spacing w:line="360" w:lineRule="auto" w:after="0"/>
         <w:ind w:left="340"/>
         <w:jc w:val="left"/>
       </w:pPr>
@@ -1756,7 +1757,7 @@
     </w:p>
     <w:p>
       <w:pPr>
-        <w:spacing w:line="240" w:lineRule="auto" w:after="0"/>
+        <w:spacing w:line="360" w:lineRule="auto" w:after="0"/>
         <w:ind w:left="340"/>
         <w:jc w:val="left"/>
       </w:pPr>
@@ -1771,7 +1772,7 @@
     </w:p>
     <w:p>
       <w:pPr>
-        <w:spacing w:line="240" w:lineRule="auto" w:after="0"/>
+        <w:spacing w:line="360" w:lineRule="auto" w:after="0"/>
         <w:ind w:left="340"/>
         <w:jc w:val="left"/>
       </w:pPr>
@@ -1786,7 +1787,7 @@
     </w:p>
     <w:p>
       <w:pPr>
-        <w:spacing w:line="240" w:lineRule="auto" w:after="0"/>
+        <w:spacing w:line="360" w:lineRule="auto" w:after="0"/>
         <w:ind w:left="340"/>
         <w:jc w:val="left"/>
       </w:pPr>
@@ -1801,7 +1802,7 @@
     </w:p>
     <w:p>
       <w:pPr>
-        <w:spacing w:line="240" w:lineRule="auto" w:after="0"/>
+        <w:spacing w:line="360" w:lineRule="auto" w:after="0"/>
         <w:ind w:left="340"/>
         <w:jc w:val="left"/>
       </w:pPr>
@@ -1816,7 +1817,7 @@
     </w:p>
     <w:p>
       <w:pPr>
-        <w:spacing w:line="240" w:lineRule="auto" w:after="0"/>
+        <w:spacing w:line="360" w:lineRule="auto" w:after="0"/>
         <w:ind w:left="340"/>
         <w:jc w:val="left"/>
       </w:pPr>
@@ -1831,7 +1832,7 @@
     </w:p>
     <w:p>
       <w:pPr>
-        <w:spacing w:line="240" w:lineRule="auto" w:after="0"/>
+        <w:spacing w:line="360" w:lineRule="auto" w:after="0"/>
         <w:ind w:left="340"/>
         <w:jc w:val="left"/>
       </w:pPr>
@@ -1846,7 +1847,7 @@
     </w:p>
     <w:p>
       <w:pPr>
-        <w:spacing w:line="240" w:lineRule="auto" w:after="0"/>
+        <w:spacing w:line="360" w:lineRule="auto" w:after="0"/>
         <w:ind w:left="340"/>
         <w:jc w:val="left"/>
       </w:pPr>
@@ -1861,7 +1862,7 @@
     </w:p>
     <w:p>
       <w:pPr>
-        <w:spacing w:line="240" w:lineRule="auto" w:after="0"/>
+        <w:spacing w:line="360" w:lineRule="auto" w:after="0"/>
         <w:ind w:left="340"/>
         <w:jc w:val="left"/>
       </w:pPr>
@@ -1891,7 +1892,7 @@
     </w:p>
     <w:p>
       <w:pPr>
-        <w:spacing w:line="240" w:lineRule="auto" w:after="0"/>
+        <w:spacing w:line="360" w:lineRule="auto" w:after="0"/>
         <w:ind w:left="340"/>
         <w:jc w:val="left"/>
       </w:pPr>
@@ -1906,7 +1907,7 @@
     </w:p>
     <w:p>
       <w:pPr>
-        <w:spacing w:line="240" w:lineRule="auto" w:after="0"/>
+        <w:spacing w:line="360" w:lineRule="auto" w:after="0"/>
         <w:ind w:left="340"/>
         <w:jc w:val="left"/>
       </w:pPr>
@@ -1921,7 +1922,7 @@
     </w:p>
     <w:p>
       <w:pPr>
-        <w:spacing w:line="240" w:lineRule="auto" w:after="0"/>
+        <w:spacing w:line="360" w:lineRule="auto" w:after="0"/>
         <w:ind w:left="340"/>
         <w:jc w:val="left"/>
       </w:pPr>
@@ -1936,7 +1937,7 @@
     </w:p>
     <w:p>
       <w:pPr>
-        <w:spacing w:line="240" w:lineRule="auto" w:after="0"/>
+        <w:spacing w:line="360" w:lineRule="auto" w:after="0"/>
         <w:ind w:left="340"/>
         <w:jc w:val="left"/>
       </w:pPr>
@@ -1951,7 +1952,7 @@
     </w:p>
     <w:p>
       <w:pPr>
-        <w:spacing w:line="240" w:lineRule="auto" w:after="0"/>
+        <w:spacing w:line="360" w:lineRule="auto" w:after="0"/>
         <w:ind w:left="340"/>
         <w:jc w:val="left"/>
       </w:pPr>
@@ -1966,7 +1967,7 @@
     </w:p>
     <w:p>
       <w:pPr>
-        <w:spacing w:line="240" w:lineRule="auto" w:after="0"/>
+        <w:spacing w:line="360" w:lineRule="auto" w:after="0"/>
         <w:ind w:left="340"/>
         <w:jc w:val="left"/>
       </w:pPr>
@@ -1981,7 +1982,7 @@
     </w:p>
     <w:p>
       <w:pPr>
-        <w:spacing w:line="240" w:lineRule="auto" w:after="0"/>
+        <w:spacing w:line="360" w:lineRule="auto" w:after="0"/>
         <w:ind w:left="340"/>
         <w:jc w:val="left"/>
       </w:pPr>
@@ -1996,7 +1997,7 @@
     </w:p>
     <w:p>
       <w:pPr>
-        <w:spacing w:line="240" w:lineRule="auto" w:after="0"/>
+        <w:spacing w:line="360" w:lineRule="auto" w:after="0"/>
         <w:ind w:left="340"/>
         <w:jc w:val="left"/>
       </w:pPr>
@@ -2011,7 +2012,7 @@
     </w:p>
     <w:p>
       <w:pPr>
-        <w:spacing w:line="240" w:lineRule="auto" w:after="0"/>
+        <w:spacing w:line="360" w:lineRule="auto" w:after="0"/>
         <w:ind w:left="340"/>
         <w:jc w:val="left"/>
       </w:pPr>
@@ -2026,7 +2027,7 @@
     </w:p>
     <w:p>
       <w:pPr>
-        <w:spacing w:line="240" w:lineRule="auto" w:after="0"/>
+        <w:spacing w:line="360" w:lineRule="auto" w:after="0"/>
         <w:ind w:left="340"/>
         <w:jc w:val="left"/>
       </w:pPr>
@@ -2041,7 +2042,7 @@
     </w:p>
     <w:p>
       <w:pPr>
-        <w:spacing w:line="240" w:lineRule="auto" w:after="0"/>
+        <w:spacing w:line="360" w:lineRule="auto" w:after="0"/>
         <w:ind w:left="340"/>
         <w:jc w:val="left"/>
       </w:pPr>
@@ -2056,7 +2057,7 @@
     </w:p>
     <w:p>
       <w:pPr>
-        <w:spacing w:line="240" w:lineRule="auto" w:after="0"/>
+        <w:spacing w:line="360" w:lineRule="auto" w:after="0"/>
         <w:ind w:left="340"/>
         <w:jc w:val="left"/>
       </w:pPr>
@@ -2071,7 +2072,7 @@
     </w:p>
     <w:p>
       <w:pPr>
-        <w:spacing w:line="240" w:lineRule="auto" w:after="0"/>
+        <w:spacing w:line="360" w:lineRule="auto" w:after="0"/>
         <w:ind w:left="340"/>
         <w:jc w:val="left"/>
       </w:pPr>
@@ -2086,7 +2087,7 @@
     </w:p>
     <w:p>
       <w:pPr>
-        <w:spacing w:line="240" w:lineRule="auto" w:after="0"/>
+        <w:spacing w:line="360" w:lineRule="auto" w:after="0"/>
         <w:ind w:left="340"/>
         <w:jc w:val="left"/>
       </w:pPr>
@@ -2101,7 +2102,7 @@
     </w:p>
     <w:p>
       <w:pPr>
-        <w:spacing w:line="240" w:lineRule="auto" w:after="0"/>
+        <w:spacing w:line="360" w:lineRule="auto" w:after="0"/>
         <w:ind w:left="340"/>
         <w:jc w:val="left"/>
       </w:pPr>
@@ -2131,7 +2132,7 @@
     </w:p>
     <w:p>
       <w:pPr>
-        <w:spacing w:line="240" w:lineRule="auto" w:after="0"/>
+        <w:spacing w:line="360" w:lineRule="auto" w:after="0"/>
         <w:ind w:left="340"/>
         <w:jc w:val="left"/>
       </w:pPr>
@@ -2146,7 +2147,7 @@
     </w:p>
     <w:p>
       <w:pPr>
-        <w:spacing w:line="240" w:lineRule="auto" w:after="0"/>
+        <w:spacing w:line="360" w:lineRule="auto" w:after="0"/>
         <w:ind w:left="340"/>
         <w:jc w:val="left"/>
       </w:pPr>
@@ -2161,7 +2162,7 @@
     </w:p>
     <w:p>
       <w:pPr>
-        <w:spacing w:line="240" w:lineRule="auto" w:after="0"/>
+        <w:spacing w:line="360" w:lineRule="auto" w:after="0"/>
         <w:ind w:left="340"/>
         <w:jc w:val="left"/>
       </w:pPr>
@@ -2176,7 +2177,7 @@
     </w:p>
     <w:p>
       <w:pPr>
-        <w:spacing w:line="240" w:lineRule="auto" w:after="0"/>
+        <w:spacing w:line="360" w:lineRule="auto" w:after="0"/>
         <w:ind w:left="340"/>
         <w:jc w:val="left"/>
       </w:pPr>
@@ -2191,7 +2192,7 @@
     </w:p>
     <w:p>
       <w:pPr>
-        <w:spacing w:line="240" w:lineRule="auto" w:after="0"/>
+        <w:spacing w:line="360" w:lineRule="auto" w:after="0"/>
         <w:ind w:left="340"/>
         <w:jc w:val="left"/>
       </w:pPr>
@@ -2206,7 +2207,7 @@
     </w:p>
     <w:p>
       <w:pPr>
-        <w:spacing w:line="240" w:lineRule="auto" w:after="0"/>
+        <w:spacing w:line="360" w:lineRule="auto" w:after="0"/>
         <w:ind w:left="340"/>
         <w:jc w:val="left"/>
       </w:pPr>
@@ -2221,7 +2222,7 @@
     </w:p>
     <w:p>
       <w:pPr>
-        <w:spacing w:line="240" w:lineRule="auto" w:after="0"/>
+        <w:spacing w:line="360" w:lineRule="auto" w:after="0"/>
         <w:ind w:left="340"/>
         <w:jc w:val="left"/>
       </w:pPr>
@@ -2236,7 +2237,7 @@
     </w:p>
     <w:p>
       <w:pPr>
-        <w:spacing w:line="240" w:lineRule="auto" w:after="0"/>
+        <w:spacing w:line="360" w:lineRule="auto" w:after="0"/>
         <w:ind w:left="340"/>
         <w:jc w:val="left"/>
       </w:pPr>
@@ -2251,7 +2252,7 @@
     </w:p>
     <w:p>
       <w:pPr>
-        <w:spacing w:line="240" w:lineRule="auto" w:after="0"/>
+        <w:spacing w:line="360" w:lineRule="auto" w:after="0"/>
         <w:ind w:left="340"/>
         <w:jc w:val="left"/>
       </w:pPr>
@@ -2266,7 +2267,7 @@
     </w:p>
     <w:p>
       <w:pPr>
-        <w:spacing w:line="240" w:lineRule="auto" w:after="0"/>
+        <w:spacing w:line="360" w:lineRule="auto" w:after="0"/>
         <w:ind w:left="340"/>
         <w:jc w:val="left"/>
       </w:pPr>
@@ -2281,7 +2282,7 @@
     </w:p>
     <w:p>
       <w:pPr>
-        <w:spacing w:line="240" w:lineRule="auto" w:after="0"/>
+        <w:spacing w:line="360" w:lineRule="auto" w:after="0"/>
         <w:ind w:left="340"/>
         <w:jc w:val="left"/>
       </w:pPr>
@@ -2296,7 +2297,7 @@
     </w:p>
     <w:p>
       <w:pPr>
-        <w:spacing w:line="240" w:lineRule="auto" w:after="0"/>
+        <w:spacing w:line="360" w:lineRule="auto" w:after="0"/>
         <w:ind w:left="340"/>
         <w:jc w:val="left"/>
       </w:pPr>
@@ -2311,7 +2312,7 @@
     </w:p>
     <w:p>
       <w:pPr>
-        <w:spacing w:line="240" w:lineRule="auto" w:after="0"/>
+        <w:spacing w:line="360" w:lineRule="auto" w:after="0"/>
         <w:ind w:left="340"/>
         <w:jc w:val="left"/>
       </w:pPr>
@@ -2326,7 +2327,7 @@
     </w:p>
     <w:p>
       <w:pPr>
-        <w:spacing w:line="240" w:lineRule="auto" w:after="0"/>
+        <w:spacing w:line="360" w:lineRule="auto" w:after="0"/>
         <w:ind w:left="340"/>
         <w:jc w:val="left"/>
       </w:pPr>
@@ -2341,7 +2342,7 @@
     </w:p>
     <w:p>
       <w:pPr>
-        <w:spacing w:line="240" w:lineRule="auto" w:after="0"/>
+        <w:spacing w:line="360" w:lineRule="auto" w:after="0"/>
         <w:ind w:left="340"/>
         <w:jc w:val="left"/>
       </w:pPr>
@@ -2356,7 +2357,7 @@
     </w:p>
     <w:p>
       <w:pPr>
-        <w:spacing w:line="240" w:lineRule="auto" w:after="0"/>
+        <w:spacing w:line="360" w:lineRule="auto" w:after="0"/>
         <w:ind w:left="340"/>
         <w:jc w:val="left"/>
       </w:pPr>
@@ -2371,7 +2372,7 @@
     </w:p>
     <w:p>
       <w:pPr>
-        <w:spacing w:line="240" w:lineRule="auto" w:after="0"/>
+        <w:spacing w:line="360" w:lineRule="auto" w:after="0"/>
         <w:ind w:left="340"/>
         <w:jc w:val="left"/>
       </w:pPr>
@@ -2386,7 +2387,7 @@
     </w:p>
     <w:p>
       <w:pPr>
-        <w:spacing w:line="240" w:lineRule="auto" w:after="0"/>
+        <w:spacing w:line="360" w:lineRule="auto" w:after="0"/>
         <w:ind w:left="340"/>
         <w:jc w:val="left"/>
       </w:pPr>
@@ -2401,7 +2402,7 @@
     </w:p>
     <w:p>
       <w:pPr>
-        <w:spacing w:line="240" w:lineRule="auto" w:after="0"/>
+        <w:spacing w:line="360" w:lineRule="auto" w:after="0"/>
         <w:ind w:left="340"/>
         <w:jc w:val="left"/>
       </w:pPr>
@@ -2416,7 +2417,7 @@
     </w:p>
     <w:p>
       <w:pPr>
-        <w:spacing w:line="240" w:lineRule="auto" w:after="0"/>
+        <w:spacing w:line="360" w:lineRule="auto" w:after="0"/>
         <w:ind w:left="340"/>
         <w:jc w:val="left"/>
       </w:pPr>
@@ -2431,7 +2432,7 @@
     </w:p>
     <w:p>
       <w:pPr>
-        <w:spacing w:line="240" w:lineRule="auto" w:after="0"/>
+        <w:spacing w:line="360" w:lineRule="auto" w:after="0"/>
         <w:ind w:left="340"/>
         <w:jc w:val="left"/>
       </w:pPr>
@@ -2446,7 +2447,7 @@
     </w:p>
     <w:p>
       <w:pPr>
-        <w:spacing w:line="240" w:lineRule="auto" w:after="0"/>
+        <w:spacing w:line="360" w:lineRule="auto" w:after="0"/>
         <w:ind w:left="340"/>
         <w:jc w:val="left"/>
       </w:pPr>
@@ -2461,7 +2462,7 @@
     </w:p>
     <w:p>
       <w:pPr>
-        <w:spacing w:line="240" w:lineRule="auto" w:after="0"/>
+        <w:spacing w:line="360" w:lineRule="auto" w:after="0"/>
         <w:ind w:left="340"/>
         <w:jc w:val="left"/>
       </w:pPr>
@@ -2476,7 +2477,7 @@
     </w:p>
     <w:p>
       <w:pPr>
-        <w:spacing w:line="240" w:lineRule="auto" w:after="0"/>
+        <w:spacing w:line="360" w:lineRule="auto" w:after="0"/>
         <w:ind w:left="340"/>
         <w:jc w:val="left"/>
       </w:pPr>
@@ -2491,7 +2492,7 @@
     </w:p>
     <w:p>
       <w:pPr>
-        <w:spacing w:line="240" w:lineRule="auto" w:after="0"/>
+        <w:spacing w:line="360" w:lineRule="auto" w:after="0"/>
         <w:ind w:left="340"/>
         <w:jc w:val="left"/>
       </w:pPr>
@@ -2506,7 +2507,7 @@
     </w:p>
     <w:p>
       <w:pPr>
-        <w:spacing w:line="240" w:lineRule="auto" w:after="0"/>
+        <w:spacing w:line="360" w:lineRule="auto" w:after="0"/>
         <w:ind w:left="340"/>
         <w:jc w:val="left"/>
       </w:pPr>
@@ -2521,7 +2522,7 @@
     </w:p>
     <w:p>
       <w:pPr>
-        <w:spacing w:line="240" w:lineRule="auto" w:after="0"/>
+        <w:spacing w:line="360" w:lineRule="auto" w:after="0"/>
         <w:ind w:left="340"/>
         <w:jc w:val="left"/>
       </w:pPr>
@@ -2536,7 +2537,7 @@
     </w:p>
     <w:p>
       <w:pPr>
-        <w:spacing w:line="240" w:lineRule="auto" w:after="0"/>
+        <w:spacing w:line="360" w:lineRule="auto" w:after="0"/>
         <w:ind w:left="340"/>
         <w:jc w:val="left"/>
       </w:pPr>
@@ -2551,7 +2552,7 @@
     </w:p>
     <w:p>
       <w:pPr>
-        <w:spacing w:line="240" w:lineRule="auto" w:after="0"/>
+        <w:spacing w:line="360" w:lineRule="auto" w:after="0"/>
         <w:ind w:left="340"/>
         <w:jc w:val="left"/>
       </w:pPr>
@@ -2566,7 +2567,7 @@
     </w:p>
     <w:p>
       <w:pPr>
-        <w:spacing w:line="240" w:lineRule="auto" w:after="0"/>
+        <w:spacing w:line="360" w:lineRule="auto" w:after="0"/>
         <w:ind w:left="340"/>
         <w:jc w:val="left"/>
       </w:pPr>
@@ -2581,7 +2582,7 @@
     </w:p>
     <w:p>
       <w:pPr>
-        <w:spacing w:line="240" w:lineRule="auto" w:after="0"/>
+        <w:spacing w:line="360" w:lineRule="auto" w:after="0"/>
         <w:ind w:left="340"/>
         <w:jc w:val="left"/>
       </w:pPr>
@@ -2596,7 +2597,7 @@
     </w:p>
     <w:p>
       <w:pPr>
-        <w:spacing w:line="240" w:lineRule="auto" w:after="0"/>
+        <w:spacing w:line="360" w:lineRule="auto" w:after="0"/>
         <w:ind w:left="340"/>
         <w:jc w:val="left"/>
       </w:pPr>
@@ -2611,7 +2612,7 @@
     </w:p>
     <w:p>
       <w:pPr>
-        <w:spacing w:line="240" w:lineRule="auto" w:after="0"/>
+        <w:spacing w:line="360" w:lineRule="auto" w:after="0"/>
         <w:ind w:left="340"/>
         <w:jc w:val="left"/>
       </w:pPr>
@@ -2626,7 +2627,7 @@
     </w:p>
     <w:p>
       <w:pPr>
-        <w:spacing w:line="240" w:lineRule="auto" w:after="0"/>
+        <w:spacing w:line="360" w:lineRule="auto" w:after="0"/>
         <w:ind w:left="340"/>
         <w:jc w:val="left"/>
       </w:pPr>
@@ -2641,7 +2642,7 @@
     </w:p>
     <w:p>
       <w:pPr>
-        <w:spacing w:line="240" w:lineRule="auto" w:after="0"/>
+        <w:spacing w:line="360" w:lineRule="auto" w:after="0"/>
         <w:ind w:left="340"/>
         <w:jc w:val="left"/>
       </w:pPr>
@@ -2656,7 +2657,7 @@
     </w:p>
     <w:p>
       <w:pPr>
-        <w:spacing w:line="240" w:lineRule="auto" w:after="0"/>
+        <w:spacing w:line="360" w:lineRule="auto" w:after="0"/>
         <w:ind w:left="340"/>
         <w:jc w:val="left"/>
       </w:pPr>
@@ -2671,7 +2672,7 @@
     </w:p>
     <w:p>
       <w:pPr>
-        <w:spacing w:line="240" w:lineRule="auto" w:after="0"/>
+        <w:spacing w:line="360" w:lineRule="auto" w:after="0"/>
         <w:ind w:left="340"/>
         <w:jc w:val="left"/>
       </w:pPr>
@@ -2686,7 +2687,7 @@
     </w:p>
     <w:p>
       <w:pPr>
-        <w:spacing w:line="240" w:lineRule="auto" w:after="0"/>
+        <w:spacing w:line="360" w:lineRule="auto" w:after="0"/>
         <w:ind w:left="340"/>
         <w:jc w:val="left"/>
       </w:pPr>
@@ -2701,7 +2702,7 @@
     </w:p>
     <w:p>
       <w:pPr>
-        <w:spacing w:line="240" w:lineRule="auto" w:after="0"/>
+        <w:spacing w:line="360" w:lineRule="auto" w:after="0"/>
         <w:ind w:left="340"/>
         <w:jc w:val="left"/>
       </w:pPr>
@@ -2716,7 +2717,7 @@
     </w:p>
     <w:p>
       <w:pPr>
-        <w:spacing w:line="240" w:lineRule="auto" w:after="0"/>
+        <w:spacing w:line="360" w:lineRule="auto" w:after="0"/>
         <w:ind w:left="340"/>
         <w:jc w:val="left"/>
       </w:pPr>
@@ -2731,7 +2732,7 @@
     </w:p>
     <w:p>
       <w:pPr>
-        <w:spacing w:line="240" w:lineRule="auto" w:after="0"/>
+        <w:spacing w:line="360" w:lineRule="auto" w:after="0"/>
         <w:ind w:left="340"/>
         <w:jc w:val="left"/>
       </w:pPr>
@@ -2746,7 +2747,7 @@
     </w:p>
     <w:p>
       <w:pPr>
-        <w:spacing w:line="240" w:lineRule="auto" w:after="0"/>
+        <w:spacing w:line="360" w:lineRule="auto" w:after="0"/>
         <w:ind w:left="340"/>
         <w:jc w:val="left"/>
       </w:pPr>
@@ -2761,7 +2762,7 @@
     </w:p>
     <w:p>
       <w:pPr>
-        <w:spacing w:line="240" w:lineRule="auto" w:after="0"/>
+        <w:spacing w:line="360" w:lineRule="auto" w:after="0"/>
         <w:ind w:left="340"/>
         <w:jc w:val="left"/>
       </w:pPr>
@@ -2776,7 +2777,7 @@
     </w:p>
     <w:p>
       <w:pPr>
-        <w:spacing w:line="240" w:lineRule="auto" w:after="0"/>
+        <w:spacing w:line="360" w:lineRule="auto" w:after="0"/>
         <w:ind w:left="340"/>
         <w:jc w:val="left"/>
       </w:pPr>
@@ -2791,7 +2792,7 @@
     </w:p>
     <w:p>
       <w:pPr>
-        <w:spacing w:line="240" w:lineRule="auto" w:after="0"/>
+        <w:spacing w:line="360" w:lineRule="auto" w:after="0"/>
         <w:ind w:left="340"/>
         <w:jc w:val="left"/>
       </w:pPr>
@@ -2806,7 +2807,7 @@
     </w:p>
     <w:p>
       <w:pPr>
-        <w:spacing w:line="240" w:lineRule="auto" w:after="0"/>
+        <w:spacing w:line="360" w:lineRule="auto" w:after="0"/>
         <w:ind w:left="340"/>
         <w:jc w:val="left"/>
       </w:pPr>
@@ -2821,7 +2822,7 @@
     </w:p>
     <w:p>
       <w:pPr>
-        <w:spacing w:line="240" w:lineRule="auto" w:after="0"/>
+        <w:spacing w:line="360" w:lineRule="auto" w:after="0"/>
         <w:ind w:left="340"/>
         <w:jc w:val="left"/>
       </w:pPr>
@@ -2836,7 +2837,7 @@
     </w:p>
     <w:p>
       <w:pPr>
-        <w:spacing w:line="240" w:lineRule="auto" w:after="0"/>
+        <w:spacing w:line="360" w:lineRule="auto" w:after="0"/>
         <w:ind w:left="340"/>
         <w:jc w:val="left"/>
       </w:pPr>
@@ -2866,7 +2867,7 @@
     </w:p>
     <w:p>
       <w:pPr>
-        <w:spacing w:line="240" w:lineRule="auto" w:after="0"/>
+        <w:spacing w:line="360" w:lineRule="auto" w:after="0"/>
         <w:ind w:left="340"/>
         <w:jc w:val="left"/>
       </w:pPr>
@@ -2881,7 +2882,7 @@
     </w:p>
     <w:p>
       <w:pPr>
-        <w:spacing w:line="240" w:lineRule="auto" w:after="0"/>
+        <w:spacing w:line="360" w:lineRule="auto" w:after="0"/>
         <w:ind w:left="340"/>
         <w:jc w:val="left"/>
       </w:pPr>
@@ -2896,7 +2897,7 @@
     </w:p>
     <w:p>
       <w:pPr>
-        <w:spacing w:line="240" w:lineRule="auto" w:after="0"/>
+        <w:spacing w:line="360" w:lineRule="auto" w:after="0"/>
         <w:ind w:left="340"/>
         <w:jc w:val="left"/>
       </w:pPr>
@@ -2911,7 +2912,7 @@
     </w:p>
     <w:p>
       <w:pPr>
-        <w:spacing w:line="240" w:lineRule="auto" w:after="0"/>
+        <w:spacing w:line="360" w:lineRule="auto" w:after="0"/>
         <w:ind w:left="340"/>
         <w:jc w:val="left"/>
       </w:pPr>
@@ -2926,7 +2927,7 @@
     </w:p>
     <w:p>
       <w:pPr>
-        <w:spacing w:line="240" w:lineRule="auto" w:after="0"/>
+        <w:spacing w:line="360" w:lineRule="auto" w:after="0"/>
         <w:ind w:left="340"/>
         <w:jc w:val="left"/>
       </w:pPr>
@@ -2941,7 +2942,7 @@
     </w:p>
     <w:p>
       <w:pPr>
-        <w:spacing w:line="240" w:lineRule="auto" w:after="0"/>
+        <w:spacing w:line="360" w:lineRule="auto" w:after="0"/>
         <w:ind w:left="340"/>
         <w:jc w:val="left"/>
       </w:pPr>
@@ -2956,7 +2957,7 @@
     </w:p>
     <w:p>
       <w:pPr>
-        <w:spacing w:line="240" w:lineRule="auto" w:after="0"/>
+        <w:spacing w:line="360" w:lineRule="auto" w:after="0"/>
         <w:ind w:left="340"/>
         <w:jc w:val="left"/>
       </w:pPr>
@@ -2971,7 +2972,7 @@
     </w:p>
     <w:p>
       <w:pPr>
-        <w:spacing w:line="240" w:lineRule="auto" w:after="0"/>
+        <w:spacing w:line="360" w:lineRule="auto" w:after="0"/>
         <w:ind w:left="340"/>
         <w:jc w:val="left"/>
       </w:pPr>
@@ -2986,7 +2987,7 @@
     </w:p>
     <w:p>
       <w:pPr>
-        <w:spacing w:line="240" w:lineRule="auto" w:after="0"/>
+        <w:spacing w:line="360" w:lineRule="auto" w:after="0"/>
         <w:ind w:left="340"/>
         <w:jc w:val="left"/>
       </w:pPr>
@@ -3001,7 +3002,7 @@
     </w:p>
     <w:p>
       <w:pPr>
-        <w:spacing w:line="240" w:lineRule="auto" w:after="0"/>
+        <w:spacing w:line="360" w:lineRule="auto" w:after="0"/>
         <w:ind w:left="340"/>
         <w:jc w:val="left"/>
       </w:pPr>
@@ -3016,7 +3017,7 @@
     </w:p>
     <w:p>
       <w:pPr>
-        <w:spacing w:line="240" w:lineRule="auto" w:after="0"/>
+        <w:spacing w:line="360" w:lineRule="auto" w:after="0"/>
         <w:ind w:left="340"/>
         <w:jc w:val="left"/>
       </w:pPr>
@@ -3031,7 +3032,7 @@
     </w:p>
     <w:p>
       <w:pPr>
-        <w:spacing w:line="240" w:lineRule="auto" w:after="0"/>
+        <w:spacing w:line="360" w:lineRule="auto" w:after="0"/>
         <w:ind w:left="340"/>
         <w:jc w:val="left"/>
       </w:pPr>
@@ -3046,7 +3047,7 @@
     </w:p>
     <w:p>
       <w:pPr>
-        <w:spacing w:line="240" w:lineRule="auto" w:after="0"/>
+        <w:spacing w:line="360" w:lineRule="auto" w:after="0"/>
         <w:ind w:left="340"/>
         <w:jc w:val="left"/>
       </w:pPr>
@@ -3061,7 +3062,7 @@
     </w:p>
     <w:p>
       <w:pPr>
-        <w:spacing w:line="240" w:lineRule="auto" w:after="0"/>
+        <w:spacing w:line="360" w:lineRule="auto" w:after="0"/>
         <w:ind w:left="340"/>
         <w:jc w:val="left"/>
       </w:pPr>
@@ -3076,7 +3077,7 @@
     </w:p>
     <w:p>
       <w:pPr>
-        <w:spacing w:line="240" w:lineRule="auto" w:after="0"/>
+        <w:spacing w:line="360" w:lineRule="auto" w:after="0"/>
         <w:ind w:left="340"/>
         <w:jc w:val="left"/>
       </w:pPr>
@@ -3091,7 +3092,7 @@
     </w:p>
     <w:p>
       <w:pPr>
-        <w:spacing w:line="240" w:lineRule="auto" w:after="0"/>
+        <w:spacing w:line="360" w:lineRule="auto" w:after="0"/>
         <w:ind w:left="340"/>
         <w:jc w:val="left"/>
       </w:pPr>
@@ -3106,7 +3107,7 @@
     </w:p>
     <w:p>
       <w:pPr>
-        <w:spacing w:line="240" w:lineRule="auto" w:after="0"/>
+        <w:spacing w:line="360" w:lineRule="auto" w:after="0"/>
         <w:ind w:left="340"/>
         <w:jc w:val="left"/>
       </w:pPr>
@@ -3121,7 +3122,7 @@
     </w:p>
     <w:p>
       <w:pPr>
-        <w:spacing w:line="240" w:lineRule="auto" w:after="0"/>
+        <w:spacing w:line="360" w:lineRule="auto" w:after="0"/>
         <w:ind w:left="340"/>
         <w:jc w:val="left"/>
       </w:pPr>
@@ -3136,7 +3137,7 @@
     </w:p>
     <w:p>
       <w:pPr>
-        <w:spacing w:line="240" w:lineRule="auto" w:after="0"/>
+        <w:spacing w:line="360" w:lineRule="auto" w:after="0"/>
         <w:ind w:left="340"/>
         <w:jc w:val="left"/>
       </w:pPr>
@@ -3151,7 +3152,7 @@
     </w:p>
     <w:p>
       <w:pPr>
-        <w:spacing w:line="240" w:lineRule="auto" w:after="0"/>
+        <w:spacing w:line="360" w:lineRule="auto" w:after="0"/>
         <w:ind w:left="340"/>
         <w:jc w:val="left"/>
       </w:pPr>
@@ -3166,7 +3167,7 @@
     </w:p>
     <w:p>
       <w:pPr>
-        <w:spacing w:line="240" w:lineRule="auto" w:after="0"/>
+        <w:spacing w:line="360" w:lineRule="auto" w:after="0"/>
         <w:ind w:left="340"/>
         <w:jc w:val="left"/>
       </w:pPr>
@@ -3181,7 +3182,7 @@
     </w:p>
     <w:p>
       <w:pPr>
-        <w:spacing w:line="240" w:lineRule="auto" w:after="0"/>
+        <w:spacing w:line="360" w:lineRule="auto" w:after="0"/>
         <w:ind w:left="340"/>
         <w:jc w:val="left"/>
       </w:pPr>
@@ -3196,7 +3197,7 @@
     </w:p>
     <w:p>
       <w:pPr>
-        <w:spacing w:line="240" w:lineRule="auto" w:after="0"/>
+        <w:spacing w:line="360" w:lineRule="auto" w:after="0"/>
         <w:ind w:left="340"/>
         <w:jc w:val="left"/>
       </w:pPr>
@@ -3211,7 +3212,7 @@
     </w:p>
     <w:p>
       <w:pPr>
-        <w:spacing w:line="240" w:lineRule="auto" w:after="0"/>
+        <w:spacing w:line="360" w:lineRule="auto" w:after="0"/>
         <w:ind w:left="340"/>
         <w:jc w:val="left"/>
       </w:pPr>
@@ -3226,7 +3227,7 @@
     </w:p>
     <w:p>
       <w:pPr>
-        <w:spacing w:line="240" w:lineRule="auto" w:after="0"/>
+        <w:spacing w:line="360" w:lineRule="auto" w:after="0"/>
         <w:ind w:left="340"/>
         <w:jc w:val="left"/>
       </w:pPr>
@@ -3241,7 +3242,7 @@
     </w:p>
     <w:p>
       <w:pPr>
-        <w:spacing w:line="240" w:lineRule="auto" w:after="0"/>
+        <w:spacing w:line="360" w:lineRule="auto" w:after="0"/>
         <w:ind w:left="340"/>
         <w:jc w:val="left"/>
       </w:pPr>
@@ -3256,7 +3257,7 @@
     </w:p>
     <w:p>
       <w:pPr>
-        <w:spacing w:line="240" w:lineRule="auto" w:after="0"/>
+        <w:spacing w:line="360" w:lineRule="auto" w:after="0"/>
         <w:ind w:left="340"/>
         <w:jc w:val="left"/>
       </w:pPr>
@@ -3271,7 +3272,7 @@
     </w:p>
     <w:p>
       <w:pPr>
-        <w:spacing w:line="240" w:lineRule="auto" w:after="0"/>
+        <w:spacing w:line="360" w:lineRule="auto" w:after="0"/>
         <w:ind w:left="340"/>
         <w:jc w:val="left"/>
       </w:pPr>
@@ -3286,7 +3287,7 @@
     </w:p>
     <w:p>
       <w:pPr>
-        <w:spacing w:line="240" w:lineRule="auto" w:after="0"/>
+        <w:spacing w:line="360" w:lineRule="auto" w:after="0"/>
         <w:ind w:left="340"/>
         <w:jc w:val="left"/>
       </w:pPr>
@@ -3301,7 +3302,7 @@
     </w:p>
     <w:p>
       <w:pPr>
-        <w:spacing w:line="240" w:lineRule="auto" w:after="0"/>
+        <w:spacing w:line="360" w:lineRule="auto" w:after="0"/>
         <w:ind w:left="340"/>
         <w:jc w:val="left"/>
       </w:pPr>
@@ -3331,7 +3332,7 @@
     </w:p>
     <w:p>
       <w:pPr>
-        <w:spacing w:line="240" w:lineRule="auto" w:after="0"/>
+        <w:spacing w:line="360" w:lineRule="auto" w:after="0"/>
         <w:ind w:left="340"/>
         <w:jc w:val="left"/>
       </w:pPr>
@@ -3346,7 +3347,7 @@
     </w:p>
     <w:p>
       <w:pPr>
-        <w:spacing w:line="240" w:lineRule="auto" w:after="0"/>
+        <w:spacing w:line="360" w:lineRule="auto" w:after="0"/>
         <w:ind w:left="340"/>
         <w:jc w:val="left"/>
       </w:pPr>
@@ -3361,7 +3362,7 @@
     </w:p>
     <w:p>
       <w:pPr>
-        <w:spacing w:line="240" w:lineRule="auto" w:after="0"/>
+        <w:spacing w:line="360" w:lineRule="auto" w:after="0"/>
         <w:ind w:left="340"/>
         <w:jc w:val="left"/>
       </w:pPr>
@@ -3376,7 +3377,7 @@
     </w:p>
     <w:p>
       <w:pPr>
-        <w:spacing w:line="240" w:lineRule="auto" w:after="0"/>
+        <w:spacing w:line="360" w:lineRule="auto" w:after="0"/>
         <w:ind w:left="340"/>
         <w:jc w:val="left"/>
       </w:pPr>
@@ -3391,7 +3392,7 @@
     </w:p>
     <w:p>
       <w:pPr>
-        <w:spacing w:line="240" w:lineRule="auto" w:after="0"/>
+        <w:spacing w:line="360" w:lineRule="auto" w:after="0"/>
         <w:ind w:left="340"/>
         <w:jc w:val="left"/>
       </w:pPr>
@@ -3421,7 +3422,7 @@
     </w:p>
     <w:p>
       <w:pPr>
-        <w:spacing w:line="240" w:lineRule="auto" w:after="0"/>
+        <w:spacing w:line="360" w:lineRule="auto" w:after="0"/>
         <w:ind w:left="340"/>
         <w:jc w:val="left"/>
       </w:pPr>
@@ -3436,7 +3437,7 @@
     </w:p>
     <w:p>
       <w:pPr>
-        <w:spacing w:line="240" w:lineRule="auto" w:after="0"/>
+        <w:spacing w:line="360" w:lineRule="auto" w:after="0"/>
         <w:ind w:left="340"/>
         <w:jc w:val="left"/>
       </w:pPr>
@@ -3451,7 +3452,7 @@
     </w:p>
     <w:p>
       <w:pPr>
-        <w:spacing w:line="240" w:lineRule="auto" w:after="0"/>
+        <w:spacing w:line="360" w:lineRule="auto" w:after="0"/>
         <w:ind w:left="340"/>
         <w:jc w:val="left"/>
       </w:pPr>
@@ -3466,7 +3467,7 @@
     </w:p>
     <w:p>
       <w:pPr>
-        <w:spacing w:line="240" w:lineRule="auto" w:after="0"/>
+        <w:spacing w:line="360" w:lineRule="auto" w:after="0"/>
         <w:ind w:left="340"/>
         <w:jc w:val="left"/>
       </w:pPr>
@@ -3481,7 +3482,7 @@
     </w:p>
     <w:p>
       <w:pPr>
-        <w:spacing w:line="240" w:lineRule="auto" w:after="0"/>
+        <w:spacing w:line="360" w:lineRule="auto" w:after="0"/>
         <w:ind w:left="340"/>
         <w:jc w:val="left"/>
       </w:pPr>
@@ -3496,7 +3497,7 @@
     </w:p>
     <w:p>
       <w:pPr>
-        <w:spacing w:line="240" w:lineRule="auto" w:after="0"/>
+        <w:spacing w:line="360" w:lineRule="auto" w:after="0"/>
         <w:ind w:left="340"/>
         <w:jc w:val="left"/>
       </w:pPr>
@@ -3511,7 +3512,7 @@
     </w:p>
     <w:p>
       <w:pPr>
-        <w:spacing w:line="240" w:lineRule="auto" w:after="0"/>
+        <w:spacing w:line="360" w:lineRule="auto" w:after="0"/>
         <w:ind w:left="340"/>
         <w:jc w:val="left"/>
       </w:pPr>
@@ -3526,7 +3527,7 @@
     </w:p>
     <w:p>
       <w:pPr>
-        <w:spacing w:line="240" w:lineRule="auto" w:after="0"/>
+        <w:spacing w:line="360" w:lineRule="auto" w:after="0"/>
         <w:ind w:left="340"/>
         <w:jc w:val="left"/>
       </w:pPr>
@@ -3541,7 +3542,7 @@
     </w:p>
     <w:p>
       <w:pPr>
-        <w:spacing w:line="240" w:lineRule="auto" w:after="0"/>
+        <w:spacing w:line="360" w:lineRule="auto" w:after="0"/>
         <w:ind w:left="340"/>
         <w:jc w:val="left"/>
       </w:pPr>
@@ -3556,7 +3557,7 @@
     </w:p>
     <w:p>
       <w:pPr>
-        <w:spacing w:line="240" w:lineRule="auto" w:after="0"/>
+        <w:spacing w:line="360" w:lineRule="auto" w:after="0"/>
         <w:ind w:left="340"/>
         <w:jc w:val="left"/>
       </w:pPr>
@@ -3615,7 +3616,7 @@
     </w:p>
     <w:p>
       <w:pPr>
-        <w:spacing w:line="240" w:lineRule="auto" w:after="0"/>
+        <w:spacing w:line="360" w:lineRule="auto" w:after="0"/>
         <w:ind w:left="340"/>
         <w:jc w:val="left"/>
       </w:pPr>
@@ -3630,7 +3631,7 @@
     </w:p>
     <w:p>
       <w:pPr>
-        <w:spacing w:line="240" w:lineRule="auto" w:after="0"/>
+        <w:spacing w:line="360" w:lineRule="auto" w:after="0"/>
         <w:ind w:left="340"/>
         <w:jc w:val="left"/>
       </w:pPr>
@@ -3645,7 +3646,7 @@
     </w:p>
     <w:p>
       <w:pPr>
-        <w:spacing w:line="240" w:lineRule="auto" w:after="0"/>
+        <w:spacing w:line="360" w:lineRule="auto" w:after="0"/>
         <w:ind w:left="340"/>
         <w:jc w:val="left"/>
       </w:pPr>
@@ -3660,7 +3661,7 @@
     </w:p>
     <w:p>
       <w:pPr>
-        <w:spacing w:line="240" w:lineRule="auto" w:after="0"/>
+        <w:spacing w:line="360" w:lineRule="auto" w:after="0"/>
         <w:ind w:left="340"/>
         <w:jc w:val="left"/>
       </w:pPr>
@@ -3690,7 +3691,7 @@
     </w:p>
     <w:p>
       <w:pPr>
-        <w:spacing w:line="240" w:lineRule="auto" w:after="0"/>
+        <w:spacing w:line="360" w:lineRule="auto" w:after="0"/>
         <w:ind w:left="340"/>
         <w:jc w:val="left"/>
       </w:pPr>
@@ -3705,7 +3706,7 @@
     </w:p>
     <w:p>
       <w:pPr>
-        <w:spacing w:line="240" w:lineRule="auto" w:after="0"/>
+        <w:spacing w:line="360" w:lineRule="auto" w:after="0"/>
         <w:ind w:left="340"/>
         <w:jc w:val="left"/>
       </w:pPr>
@@ -3720,7 +3721,7 @@
     </w:p>
     <w:p>
       <w:pPr>
-        <w:spacing w:line="240" w:lineRule="auto" w:after="0"/>
+        <w:spacing w:line="360" w:lineRule="auto" w:after="0"/>
         <w:ind w:left="340"/>
         <w:jc w:val="left"/>
       </w:pPr>
@@ -3735,7 +3736,7 @@
     </w:p>
     <w:p>
       <w:pPr>
-        <w:spacing w:line="240" w:lineRule="auto" w:after="0"/>
+        <w:spacing w:line="360" w:lineRule="auto" w:after="0"/>
         <w:ind w:left="340"/>
         <w:jc w:val="left"/>
       </w:pPr>
@@ -3750,7 +3751,7 @@
     </w:p>
     <w:p>
       <w:pPr>
-        <w:spacing w:line="240" w:lineRule="auto" w:after="0"/>
+        <w:spacing w:line="360" w:lineRule="auto" w:after="0"/>
         <w:ind w:left="340"/>
         <w:jc w:val="left"/>
       </w:pPr>
@@ -3765,7 +3766,7 @@
     </w:p>
     <w:p>
       <w:pPr>
-        <w:spacing w:line="240" w:lineRule="auto" w:after="0"/>
+        <w:spacing w:line="360" w:lineRule="auto" w:after="0"/>
         <w:ind w:left="340"/>
         <w:jc w:val="left"/>
       </w:pPr>
@@ -3780,7 +3781,7 @@
     </w:p>
     <w:p>
       <w:pPr>
-        <w:spacing w:line="240" w:lineRule="auto" w:after="0"/>
+        <w:spacing w:line="360" w:lineRule="auto" w:after="0"/>
         <w:ind w:left="340"/>
         <w:jc w:val="left"/>
       </w:pPr>
@@ -3795,7 +3796,7 @@
     </w:p>
     <w:p>
       <w:pPr>
-        <w:spacing w:line="240" w:lineRule="auto" w:after="0"/>
+        <w:spacing w:line="360" w:lineRule="auto" w:after="0"/>
         <w:ind w:left="340"/>
         <w:jc w:val="left"/>
       </w:pPr>
@@ -3810,7 +3811,7 @@
     </w:p>
     <w:p>
       <w:pPr>
-        <w:spacing w:line="240" w:lineRule="auto" w:after="0"/>
+        <w:spacing w:line="360" w:lineRule="auto" w:after="0"/>
         <w:ind w:left="340"/>
         <w:jc w:val="left"/>
       </w:pPr>
@@ -3825,7 +3826,7 @@
     </w:p>
     <w:p>
       <w:pPr>
-        <w:spacing w:line="240" w:lineRule="auto" w:after="0"/>
+        <w:spacing w:line="360" w:lineRule="auto" w:after="0"/>
         <w:ind w:left="340"/>
         <w:jc w:val="left"/>
       </w:pPr>
@@ -3840,7 +3841,7 @@
     </w:p>
     <w:p>
       <w:pPr>
-        <w:spacing w:line="240" w:lineRule="auto" w:after="0"/>
+        <w:spacing w:line="360" w:lineRule="auto" w:after="0"/>
         <w:ind w:left="340"/>
         <w:jc w:val="left"/>
       </w:pPr>
@@ -3884,6 +3885,7 @@
     </w:p>
     <w:p>
       <w:pPr>
+        <w:spacing w:line="360" w:lineRule="auto"/>
         <w:jc w:val="center"/>
       </w:pPr>
       <w:r>
@@ -3951,7 +3953,7 @@
           <w:b/>
           <w:sz w:val="28"/>
         </w:rPr>
-        <w:t>[ВСТАВИТЬ СКРИНШОТ: обнаружение и запуск unittest в обозревателе тестов Visual Studio]</w:t>
+        <w:t>[ВСТАВИТЬ СКРИНШОТ: PyCharm, окно Run/Tests с результатом запуска unittest: 6 tests passed / OK]</w:t>
       </w:r>
     </w:p>
     <w:p>
@@ -3965,7 +3967,7 @@
           <w:b w:val="0"/>
           <w:sz w:val="24"/>
         </w:rPr>
-        <w:t>Рисунок 2 — Результат запуска тестов в Visual Studio Test Explorer</w:t>
+        <w:t>Рисунок 2 — Результат запуска unittest-тестов в PyCharm</w:t>
       </w:r>
     </w:p>
     <w:p>
@@ -3994,7 +3996,67 @@
           <w:b w:val="0"/>
           <w:sz w:val="28"/>
         </w:rPr>
-        <w:t>В среде Codex/ macOS Visual Studio с командой Debug &gt; Launch Python Profiling недоступна, поэтому для автоматической проверки выполнено профилирование стандартным инструментом Python cProfile. Этот результат не выдуман и сохранен в reports/profile_run1.prof, reports/profile_run2.prof и текстовых отчетах reports/profile_run1.txt, reports/profile_run2.txt, reports/profile_compare.txt.</w:t>
+        <w:t>В текущей среде автоматическая проверка профилирования выполнена стандартным инструментом Python cProfile. Так как у меня доступен PyCharm, ручные скриншоты для сдачи можно сделать именно в PyCharm: через встроенный Profiler в PyCharm Professional или через Terminal в PyCharm Community с теми же командами cProfile. Результаты cProfile сохранены в reports/profile_run1.prof, reports/profile_run2.prof и текстовых отчетах reports/profile_run1.txt, reports/profile_run2.txt, reports/profile_compare.txt.</w:t>
+      </w:r>
+    </w:p>
+    <w:p>
+      <w:pPr>
+        <w:pStyle w:val="ListBullet"/>
+        <w:spacing w:line="360" w:lineRule="auto" w:after="120"/>
+        <w:jc w:val="both"/>
+      </w:pPr>
+      <w:r>
+        <w:rPr>
+          <w:rFonts w:ascii="Times New Roman" w:hAnsi="Times New Roman" w:eastAsia="Times New Roman" w:cs="Times New Roman"/>
+          <w:b w:val="0"/>
+          <w:sz w:val="28"/>
+        </w:rPr>
+        <w:t>Инструкция для рисунка 2: открыть проект в PyCharm, выбрать интерпретатор с установленным bottle, открыть вкладку Terminal или Run, выполнить python3 -m unittest discover -s . -p "utest_*.py" -v и сделать скрин окна, где видно Ran 6 tests и OK.</w:t>
+      </w:r>
+    </w:p>
+    <w:p>
+      <w:pPr>
+        <w:pStyle w:val="ListBullet"/>
+        <w:spacing w:line="360" w:lineRule="auto" w:after="120"/>
+        <w:jc w:val="both"/>
+      </w:pPr>
+      <w:r>
+        <w:rPr>
+          <w:rFonts w:ascii="Times New Roman" w:hAnsi="Times New Roman" w:eastAsia="Times New Roman" w:cs="Times New Roman"/>
+          <w:b w:val="0"/>
+          <w:sz w:val="28"/>
+        </w:rPr>
+        <w:t>Инструкция для рисунка 3, если PyCharm Professional: открыть app.py, нажать Run &gt; Profile или выбрать Profile app.py, дождаться запуска сервера localhost:8080, открыть страницу сайта, отправить форму, остановить процесс и сделать скрин окна Profiler/Call Tree.</w:t>
+      </w:r>
+    </w:p>
+    <w:p>
+      <w:pPr>
+        <w:pStyle w:val="ListBullet"/>
+        <w:spacing w:line="360" w:lineRule="auto" w:after="120"/>
+        <w:jc w:val="both"/>
+      </w:pPr>
+      <w:r>
+        <w:rPr>
+          <w:rFonts w:ascii="Times New Roman" w:hAnsi="Times New Roman" w:eastAsia="Times New Roman" w:cs="Times New Roman"/>
+          <w:b w:val="0"/>
+          <w:sz w:val="28"/>
+        </w:rPr>
+        <w:t>Инструкция для рисунка 3, если PyCharm Community: открыть Terminal в PyCharm и выполнить python -m cProfile -o reports/profile_run1.prof app.py; после запуска сервера открыть http://localhost:8080, отправить форму, остановить сервер Ctrl+C и сделать скрин Terminal с командой и логами запросов.</w:t>
+      </w:r>
+    </w:p>
+    <w:p>
+      <w:pPr>
+        <w:pStyle w:val="ListBullet"/>
+        <w:spacing w:line="360" w:lineRule="auto" w:after="120"/>
+        <w:jc w:val="both"/>
+      </w:pPr>
+      <w:r>
+        <w:rPr>
+          <w:rFonts w:ascii="Times New Roman" w:hAnsi="Times New Roman" w:eastAsia="Times New Roman" w:cs="Times New Roman"/>
+          <w:b w:val="0"/>
+          <w:sz w:val="28"/>
+        </w:rPr>
+        <w:t>Инструкция для рисунка 4: повторить профилирование вторым запуском с reports/profile_run2.prof, затем открыть reports/profile_summary.txt или reports/profile_compare.txt в PyCharm и сделать скрин с двумя запусками и сравнением времени.</w:t>
       </w:r>
     </w:p>
     <w:p>
@@ -4045,7 +4107,6 @@
     <w:p>
       <w:pPr>
         <w:spacing w:line="240" w:lineRule="auto" w:after="0"/>
-        <w:ind w:left="340"/>
         <w:jc w:val="left"/>
       </w:pPr>
       <w:r>
@@ -4060,7 +4121,6 @@
     <w:p>
       <w:pPr>
         <w:spacing w:line="240" w:lineRule="auto" w:after="0"/>
-        <w:ind w:left="340"/>
         <w:jc w:val="left"/>
       </w:pPr>
       <w:r>
@@ -4075,7 +4135,6 @@
     <w:p>
       <w:pPr>
         <w:spacing w:line="240" w:lineRule="auto" w:after="0"/>
-        <w:ind w:left="340"/>
         <w:jc w:val="left"/>
       </w:pPr>
       <w:r>
@@ -4112,7 +4171,7 @@
           <w:b/>
           <w:sz w:val="28"/>
         </w:rPr>
-        <w:t>[ВСТАВИТЬ СКРИНШОТ: окно Visual Studio Python Profiling после запуска Bottle-проекта]</w:t>
+        <w:t>[ВСТАВИТЬ СКРИНШОТ: PyCharm Profiler или Terminal с первым запуском профилирования app.py]</w:t>
       </w:r>
     </w:p>
     <w:p>
@@ -4126,7 +4185,7 @@
           <w:b w:val="0"/>
           <w:sz w:val="24"/>
         </w:rPr>
-        <w:t>Рисунок 3 — Запуск профилирования Python в Visual Studio</w:t>
+        <w:t>Рисунок 3 — Запуск профилирования Bottle-проекта в PyCharm</w:t>
       </w:r>
     </w:p>
     <w:p>
@@ -4140,7 +4199,7 @@
           <w:b/>
           <w:sz w:val="28"/>
         </w:rPr>
-        <w:t>[ВСТАВИТЬ СКРИНШОТ: сравнительный отчет профилирования Visual Studio для двух запусков]</w:t>
+        <w:t>[ВСТАВИТЬ СКРИНШОТ: PyCharm с reports/profile_summary.txt или reports/profile_compare.txt для двух запусков]</w:t>
       </w:r>
     </w:p>
     <w:p>
@@ -4154,7 +4213,7 @@
           <w:b w:val="0"/>
           <w:sz w:val="24"/>
         </w:rPr>
-        <w:t>Рисунок 4 — Сравнение результатов профилирования</w:t>
+        <w:t>Рисунок 4 — Сравнение результатов профилирования в PyCharm</w:t>
       </w:r>
     </w:p>
     <w:p>
@@ -4872,6 +4931,7 @@
     </w:tbl>
     <w:p>
       <w:pPr>
+        <w:spacing w:line="360" w:lineRule="auto"/>
         <w:jc w:val="both"/>
       </w:pPr>
     </w:p>
@@ -4936,6 +4996,7 @@
     </w:p>
     <w:p>
       <w:pPr>
+        <w:spacing w:line="360" w:lineRule="auto"/>
         <w:jc w:val="center"/>
       </w:pPr>
       <w:r>
@@ -4994,6 +5055,7 @@
     </w:p>
     <w:p>
       <w:pPr>
+        <w:spacing w:line="360" w:lineRule="auto"/>
         <w:jc w:val="center"/>
       </w:pPr>
       <w:r>
@@ -5052,6 +5114,7 @@
     </w:p>
     <w:p>
       <w:pPr>
+        <w:spacing w:line="360" w:lineRule="auto"/>
         <w:jc w:val="center"/>
       </w:pPr>
       <w:r>
@@ -5321,7 +5384,7 @@
           <w:b w:val="0"/>
           <w:sz w:val="28"/>
         </w:rPr>
-        <w:t>Для задания подготовлены два коммита: Add lab tests and email validation; Add lab report and verification artifacts. Работа выполняется в ветке codex/lr9-12 с последующей отправкой на GitHub.</w:t>
+        <w:t>Для задания подготовлены два основных коммита: Add lab tests and email validation; Add lab report and verification artifacts. После адаптации отчета под PyCharm добавлен дополнительный коммит Update lab report for PyCharm workflow. Работа выполняется в ветке codex/lr9-12, ветка отправлена на GitHub.</w:t>
       </w:r>
     </w:p>
     <w:p>
@@ -5371,7 +5434,7 @@
     <w:p>
       <w:pPr>
         <w:pStyle w:val="ListBullet"/>
-        <w:spacing w:line="360" w:lineRule="auto" w:after="80"/>
+        <w:spacing w:line="360" w:lineRule="auto" w:after="120"/>
         <w:jc w:val="both"/>
       </w:pPr>
       <w:r>
@@ -5380,13 +5443,13 @@
           <w:b w:val="0"/>
           <w:sz w:val="28"/>
         </w:rPr>
-        <w:t>В Windows/Visual Studio повторить пункт Debug &gt; Launch Python Profiling для Bottle-проекта, сохранить отчет и заменить заглушки на рисунках 3 и 4 реальными скриншотами.</w:t>
+        <w:t>В PyCharm открыть проект Rozhnev_BottleSite и проверить интерпретатор: File &gt; Settings &gt; Project &gt; Python Interpreter. Если зависимостей нет, в Terminal выполнить python3 -m venv .venv, source .venv/bin/activate, pip install -r requirements.txt.</w:t>
       </w:r>
     </w:p>
     <w:p>
       <w:pPr>
         <w:pStyle w:val="ListBullet"/>
-        <w:spacing w:line="360" w:lineRule="auto" w:after="80"/>
+        <w:spacing w:line="360" w:lineRule="auto" w:after="120"/>
         <w:jc w:val="both"/>
       </w:pPr>
       <w:r>
@@ -5395,13 +5458,58 @@
           <w:b w:val="0"/>
           <w:sz w:val="28"/>
         </w:rPr>
-        <w:t>Открыть Test Explorer в Visual Studio, запустить unittest-тесты и заменить заглушку на рисунке 2 скриншотом результата, если преподаватель требует именно интерфейс Visual Studio.</w:t>
+        <w:t>Для рисунка 2 запустить тесты в PyCharm: Terminal -&gt; python3 -m unittest discover -s . -p "utest_*.py" -v. Скрин должен показывать список тестов и строку OK / Ran 6 tests.</w:t>
       </w:r>
     </w:p>
     <w:p>
       <w:pPr>
         <w:pStyle w:val="ListBullet"/>
-        <w:spacing w:line="360" w:lineRule="auto" w:after="80"/>
+        <w:spacing w:line="360" w:lineRule="auto" w:after="120"/>
+        <w:jc w:val="both"/>
+      </w:pPr>
+      <w:r>
+        <w:rPr>
+          <w:rFonts w:ascii="Times New Roman" w:hAnsi="Times New Roman" w:eastAsia="Times New Roman" w:cs="Times New Roman"/>
+          <w:b w:val="0"/>
+          <w:sz w:val="28"/>
+        </w:rPr>
+        <w:t>Для рисунка 3 запустить профилирование. В PyCharm Professional использовать Run &gt; Profile app.py; в PyCharm Community использовать Terminal -&gt; python -m cProfile -o reports/profile_run1.prof app.py. После старта сервера открыть сайт и отправить форму, затем остановить процесс Ctrl+C. Скрин должен показывать команду профилирования и логи запросов или окно Profiler.</w:t>
+      </w:r>
+    </w:p>
+    <w:p>
+      <w:pPr>
+        <w:pStyle w:val="ListBullet"/>
+        <w:spacing w:line="360" w:lineRule="auto" w:after="120"/>
+        <w:jc w:val="both"/>
+      </w:pPr>
+      <w:r>
+        <w:rPr>
+          <w:rFonts w:ascii="Times New Roman" w:hAnsi="Times New Roman" w:eastAsia="Times New Roman" w:cs="Times New Roman"/>
+          <w:b w:val="0"/>
+          <w:sz w:val="28"/>
+        </w:rPr>
+        <w:t>Для рисунка 4 сделать второй запуск профилирования с reports/profile_run2.prof, затем открыть reports/profile_summary.txt или reports/profile_compare.txt в PyCharm. Скрин должен показывать оба запуска и среднее время simple_server.server_bind.</w:t>
+      </w:r>
+    </w:p>
+    <w:p>
+      <w:pPr>
+        <w:pStyle w:val="ListBullet"/>
+        <w:spacing w:line="360" w:lineRule="auto" w:after="120"/>
+        <w:jc w:val="both"/>
+      </w:pPr>
+      <w:r>
+        <w:rPr>
+          <w:rFonts w:ascii="Times New Roman" w:hAnsi="Times New Roman" w:eastAsia="Times New Roman" w:cs="Times New Roman"/>
+          <w:b w:val="0"/>
+          <w:sz w:val="28"/>
+        </w:rPr>
+        <w:t>Скриншоты WAVE уже вставлены в отчет. Если сервис WAVE у тебя покажет другие числа, можно оставить мои скриншоты как результат на момент проверки или заменить своими актуальными.</w:t>
+      </w:r>
+    </w:p>
+    <w:p>
+      <w:pPr>
+        <w:pStyle w:val="ListBullet"/>
+        <w:spacing w:line="360" w:lineRule="auto" w:after="120"/>
         <w:jc w:val="both"/>
       </w:pPr>
       <w:r>
@@ -5416,7 +5524,7 @@
     <w:p>
       <w:pPr>
         <w:pStyle w:val="ListBullet"/>
-        <w:spacing w:line="360" w:lineRule="auto" w:after="80"/>
+        <w:spacing w:line="360" w:lineRule="auto" w:after="120"/>
         <w:jc w:val="both"/>
       </w:pPr>
       <w:r>

</xml_diff>